<commit_message>
Handleiding bijgewerkt: 5 sites, breder zoekgebied, weekrapport en vangnet-label
Co-Authored-By: Claude Opus 4.8 <noreply@anthropic.com>
</commit_message>
<xml_diff>
--- a/README.docx
+++ b/README.docx
@@ -20,7 +20,21 @@
     </w:p>
     <w:p>
       <w:r>
-        <w:t>Deze monitor checkt automatisch elke 5 minuten drie antikraak-websites op nieuwe woningen in Haarlem. Als er iets nieuws verschijnt, krijg je direct een bericht op Telegram met de titel, prijs, en een link naar de listing.</w:t>
+        <w:t xml:space="preserve">Deze monitor checkt automatisch elke 5 minuten vijf antikraak-websites op nieuwe woonruimte in het zoekgebied: </w:t>
+      </w:r>
+      <w:r>
+        <w:rPr>
+          <w:b/>
+        </w:rPr>
+        <w:t>Haarlem, Heemstede, Overveen en Santpoort</w:t>
+      </w:r>
+      <w:r>
+        <w:t>. Als er iets nieuws verschijnt, krijg je direct een bericht op Telegram met de titel, prijs, en een link naar de listing.</w:t>
+      </w:r>
+    </w:p>
+    <w:p>
+      <w:r>
+        <w:t>Het zoekgebied aanpassen? Vraag Claude Code: *"Pas het zoekgebied van mijn antikraak-monitor aan (TARGET_PLACES in shared.py)"*.</w:t>
       </w:r>
     </w:p>
     <w:p>
@@ -130,7 +144,7 @@
           </w:tcPr>
           <w:p>
             <w:r>
-              <w:t>Haalt de Haarlem-pagina op, zoekt alle listings, filtert op "Haarlem" (de site toont ook andere steden).</w:t>
+              <w:t>Haalt de Haarlem-pagina op, zoekt alle listings, filtert op het zoekgebied.</w:t>
             </w:r>
           </w:p>
         </w:tc>
@@ -155,7 +169,7 @@
           </w:tcPr>
           <w:p>
             <w:r>
-              <w:t>Haalt de aanbodpagina op, zoekt alle listings, filtert op "Haarlem".</w:t>
+              <w:t>Haalt de aanbodpagina op, zoekt alle listings, filtert op het zoekgebied.</w:t>
             </w:r>
           </w:p>
         </w:tc>
@@ -172,6 +186,9 @@
               </w:rPr>
               <w:t>Gapph</w:t>
             </w:r>
+            <w:r>
+              <w:t xml:space="preserve"> (incl. Villex &amp; Interveste, die zijn opgegaan in Gapph)</w:t>
+            </w:r>
           </w:p>
         </w:tc>
         <w:tc>
@@ -180,7 +197,57 @@
           </w:tcPr>
           <w:p>
             <w:r>
-              <w:t>Gebruikt de zoekfunctie van Gapph om listings in de buurt van Haarlem te vinden, filtert op exact "Haarlem".</w:t>
+              <w:t>Haalt het volledige actuele aanbod op, filtert op het zoekgebied, en dubbelcheckt per match of de woning echt nog beschikbaar is.</w:t>
+            </w:r>
+          </w:p>
+        </w:tc>
+      </w:tr>
+      <w:tr>
+        <w:tc>
+          <w:tcPr>
+            <w:tcW w:type="dxa" w:w="4320"/>
+          </w:tcPr>
+          <w:p>
+            <w:r>
+              <w:rPr>
+                <w:b/>
+              </w:rPr>
+              <w:t>Ad Hoc Beheer</w:t>
+            </w:r>
+          </w:p>
+        </w:tc>
+        <w:tc>
+          <w:tcPr>
+            <w:tcW w:type="dxa" w:w="4320"/>
+          </w:tcPr>
+          <w:p>
+            <w:r>
+              <w:t>Haalt het volledige aanbod op (ruim 100 listings), filtert op woonruimte in het zoekgebied.</w:t>
+            </w:r>
+          </w:p>
+        </w:tc>
+      </w:tr>
+      <w:tr>
+        <w:tc>
+          <w:tcPr>
+            <w:tcW w:type="dxa" w:w="4320"/>
+          </w:tcPr>
+          <w:p>
+            <w:r>
+              <w:rPr>
+                <w:b/>
+              </w:rPr>
+              <w:t>De Kabath</w:t>
+            </w:r>
+          </w:p>
+        </w:tc>
+        <w:tc>
+          <w:tcPr>
+            <w:tcW w:type="dxa" w:w="4320"/>
+          </w:tcPr>
+          <w:p>
+            <w:r>
+              <w:t>Haalt de aanbodpagina op (alleen woonruimte), filtert op het zoekgebied.</w:t>
             </w:r>
           </w:p>
         </w:tc>
@@ -382,7 +449,7 @@
               <w:rPr>
                 <w:b/>
               </w:rPr>
-              <w:t>Nieuwe antikraak in Haarlem!</w:t>
+              <w:t>Nieuwe antikraak gevonden!</w:t>
             </w:r>
           </w:p>
         </w:tc>
@@ -392,7 +459,35 @@
           </w:tcPr>
           <w:p>
             <w:r>
-              <w:t>Er is een nieuwe listing gevonden. Klik op de link om te reageren.</w:t>
+              <w:t>Er is een nieuwe listing gevonden. Klik op de link om te reageren — snel zijn!</w:t>
+            </w:r>
+          </w:p>
+        </w:tc>
+      </w:tr>
+      <w:tr>
+        <w:tc>
+          <w:tcPr>
+            <w:tcW w:type="dxa" w:w="4320"/>
+          </w:tcPr>
+          <w:p>
+            <w:r>
+              <w:t xml:space="preserve">💓 </w:t>
+            </w:r>
+            <w:r>
+              <w:rPr>
+                <w:b/>
+              </w:rPr>
+              <w:t>Weekrapport antikraak-monitor</w:t>
+            </w:r>
+          </w:p>
+        </w:tc>
+        <w:tc>
+          <w:tcPr>
+            <w:tcW w:type="dxa" w:w="4320"/>
+          </w:tcPr>
+          <w:p>
+            <w:r>
+              <w:t>Wekelijks levensteken: de monitor draait, met per site de status. Blijft dit uit? Dan is er iets mis — vraag Claude Code om te kijken.</w:t>
             </w:r>
           </w:p>
         </w:tc>
@@ -477,6 +572,34 @@
           <w:p>
             <w:r>
               <w:t>Er is iets ernstigs misgegaan. Zie hieronder hoe je dit oplost.</w:t>
+            </w:r>
+          </w:p>
+        </w:tc>
+      </w:tr>
+      <w:tr>
+        <w:tc>
+          <w:tcPr>
+            <w:tcW w:type="dxa" w:w="4320"/>
+          </w:tcPr>
+          <w:p>
+            <w:r>
+              <w:t xml:space="preserve">🛟 </w:t>
+            </w:r>
+            <w:r>
+              <w:rPr>
+                <w:b/>
+              </w:rPr>
+              <w:t>...via het GitHub-vangnet</w:t>
+            </w:r>
+          </w:p>
+        </w:tc>
+        <w:tc>
+          <w:tcPr>
+            <w:tcW w:type="dxa" w:w="4320"/>
+          </w:tcPr>
+          <w:p>
+            <w:r>
+              <w:t>Dit label onder een bericht betekent: verstuurd door het vangnet. Dezelfde woning kan al eerder via je Mac gemeld zijn.</w:t>
             </w:r>
           </w:p>
         </w:tc>
@@ -1365,7 +1488,7 @@
               <w:t>publieke</w:t>
             </w:r>
             <w:r>
-              <w:t xml:space="preserve"> aanbod via de zoekfunctie. Om te reageren op een listing heb je wel een account nodig.</w:t>
+              <w:t xml:space="preserve"> aanbod. Om te reageren op een listing heb je wel een account nodig.</w:t>
             </w:r>
           </w:p>
         </w:tc>
@@ -1380,7 +1503,7 @@
               <w:rPr>
                 <w:b/>
               </w:rPr>
-              <w:t>De Kabath</w:t>
+              <w:t>Villex &amp; Interveste</w:t>
             </w:r>
           </w:p>
         </w:tc>
@@ -1390,7 +1513,82 @@
           </w:tcPr>
           <w:p>
             <w:r>
-              <w:t>Bewust overgeslagen — alleen marketingtekst op de publieke pagina, aanbod vermoedelijk achter login.</w:t>
+              <w:t>Bestaan niet meer als aparte sites — opgegaan in Gapph, dus automatisch gedekt.</w:t>
+            </w:r>
+          </w:p>
+        </w:tc>
+      </w:tr>
+      <w:tr>
+        <w:tc>
+          <w:tcPr>
+            <w:tcW w:type="dxa" w:w="4320"/>
+          </w:tcPr>
+          <w:p>
+            <w:r>
+              <w:rPr>
+                <w:b/>
+              </w:rPr>
+              <w:t>Zwerfkei &amp; Bewaakt en Bewoond</w:t>
+            </w:r>
+          </w:p>
+        </w:tc>
+        <w:tc>
+          <w:tcPr>
+            <w:tcW w:type="dxa" w:w="4320"/>
+          </w:tcPr>
+          <w:p>
+            <w:r>
+              <w:t>Melden aanbod alleen via Facebook, niets om uit te lezen op hun website.</w:t>
+            </w:r>
+          </w:p>
+        </w:tc>
+      </w:tr>
+      <w:tr>
+        <w:tc>
+          <w:tcPr>
+            <w:tcW w:type="dxa" w:w="4320"/>
+          </w:tcPr>
+          <w:p>
+            <w:r>
+              <w:rPr>
+                <w:b/>
+              </w:rPr>
+              <w:t>Prevenda</w:t>
+            </w:r>
+          </w:p>
+        </w:tc>
+        <w:tc>
+          <w:tcPr>
+            <w:tcW w:type="dxa" w:w="4320"/>
+          </w:tcPr>
+          <w:p>
+            <w:r>
+              <w:t>Aanbodpagina is technisch niet uitleesbaar zonder browser (JavaScript).</w:t>
+            </w:r>
+          </w:p>
+        </w:tc>
+      </w:tr>
+      <w:tr>
+        <w:tc>
+          <w:tcPr>
+            <w:tcW w:type="dxa" w:w="4320"/>
+          </w:tcPr>
+          <w:p>
+            <w:r>
+              <w:rPr>
+                <w:b/>
+              </w:rPr>
+              <w:t>Alvast</w:t>
+            </w:r>
+          </w:p>
+        </w:tc>
+        <w:tc>
+          <w:tcPr>
+            <w:tcW w:type="dxa" w:w="4320"/>
+          </w:tcPr>
+          <w:p>
+            <w:r>
+              <w:t>Wel uitleesbaar, maar had bij onderzoek (juli 2026) geen aanbod in de regio. Eenvoudig toe te voegen als dat verandert.</w:t>
             </w:r>
           </w:p>
         </w:tc>
@@ -1524,7 +1722,23 @@
           <w:rFonts w:ascii="Courier New" w:hAnsi="Courier New"/>
           <w:sz w:val="18"/>
         </w:rPr>
-        <w:t>│   └── gapph.py             ← Gapph scraper</w:t>
+        <w:t>│   ├── gapph.py             ← Gapph scraper (incl. Villex &amp; Interveste)</w:t>
+        <w:br/>
+      </w:r>
+      <w:r>
+        <w:rPr>
+          <w:rFonts w:ascii="Courier New" w:hAnsi="Courier New"/>
+          <w:sz w:val="18"/>
+        </w:rPr>
+        <w:t>│   ├── adhoc.py             ← Ad Hoc Beheer scraper</w:t>
+        <w:br/>
+      </w:r>
+      <w:r>
+        <w:rPr>
+          <w:rFonts w:ascii="Courier New" w:hAnsi="Courier New"/>
+          <w:sz w:val="18"/>
+        </w:rPr>
+        <w:t>│   └── dekabath.py          ← De Kabath scraper</w:t>
         <w:br/>
       </w:r>
       <w:r>

</xml_diff>

<commit_message>
Ad Hoc verwijderd: voordrachtsysteem maakt snelle meldingen zinloos zonder bestaande bewoner als contact
Co-Authored-By: Claude Opus 4.8 <noreply@anthropic.com>
</commit_message>
<xml_diff>
--- a/README.docx
+++ b/README.docx
@@ -20,7 +20,7 @@
     </w:p>
     <w:p>
       <w:r>
-        <w:t xml:space="preserve">Deze monitor checkt automatisch elke 5 minuten vijf antikraak-websites op nieuwe woonruimte in het zoekgebied: </w:t>
+        <w:t xml:space="preserve">Deze monitor checkt automatisch elke 5 minuten vier antikraak-websites op nieuwe woonruimte in het zoekgebied: </w:t>
       </w:r>
       <w:r>
         <w:rPr>
@@ -198,31 +198,6 @@
           <w:p>
             <w:r>
               <w:t>Haalt het volledige actuele aanbod op, filtert op het zoekgebied, en dubbelcheckt per match of de woning echt nog beschikbaar is.</w:t>
-            </w:r>
-          </w:p>
-        </w:tc>
-      </w:tr>
-      <w:tr>
-        <w:tc>
-          <w:tcPr>
-            <w:tcW w:type="dxa" w:w="4320"/>
-          </w:tcPr>
-          <w:p>
-            <w:r>
-              <w:rPr>
-                <w:b/>
-              </w:rPr>
-              <w:t>Ad Hoc Beheer</w:t>
-            </w:r>
-          </w:p>
-        </w:tc>
-        <w:tc>
-          <w:tcPr>
-            <w:tcW w:type="dxa" w:w="4320"/>
-          </w:tcPr>
-          <w:p>
-            <w:r>
-              <w:t>Haalt het volledige aanbod op (ruim 100 listings), filtert op woonruimte in het zoekgebied.</w:t>
             </w:r>
           </w:p>
         </w:tc>
@@ -1528,6 +1503,31 @@
               <w:rPr>
                 <w:b/>
               </w:rPr>
+              <w:t>Ad Hoc Beheer</w:t>
+            </w:r>
+          </w:p>
+        </w:tc>
+        <w:tc>
+          <w:tcPr>
+            <w:tcW w:type="dxa" w:w="4320"/>
+          </w:tcPr>
+          <w:p>
+            <w:r>
+              <w:t>In juli 2026 kort gemonitord en weer verwijderd: Ad Hoc werkt met een voordrachtsysteem ("je kunt je alleen inschrijven als een huidige bewoner je voordraagt"). Zonder voordracht heb je niets aan snelle meldingen. Weer toevoegen kan altijd (zie "Site toevoegen") als je iemand kent die via Ad Hoc woont.</w:t>
+            </w:r>
+          </w:p>
+        </w:tc>
+      </w:tr>
+      <w:tr>
+        <w:tc>
+          <w:tcPr>
+            <w:tcW w:type="dxa" w:w="4320"/>
+          </w:tcPr>
+          <w:p>
+            <w:r>
+              <w:rPr>
+                <w:b/>
+              </w:rPr>
               <w:t>Zwerfkei &amp; Bewaakt en Bewoond</w:t>
             </w:r>
           </w:p>
@@ -1723,14 +1723,6 @@
           <w:sz w:val="18"/>
         </w:rPr>
         <w:t>│   ├── gapph.py             ← Gapph scraper (incl. Villex &amp; Interveste)</w:t>
-        <w:br/>
-      </w:r>
-      <w:r>
-        <w:rPr>
-          <w:rFonts w:ascii="Courier New" w:hAnsi="Courier New"/>
-          <w:sz w:val="18"/>
-        </w:rPr>
-        <w:t>│   ├── adhoc.py             ← Ad Hoc Beheer scraper</w:t>
         <w:br/>
       </w:r>
       <w:r>

</xml_diff>